<commit_message>
comments updated, implemented Doxygen
</commit_message>
<xml_diff>
--- a/Documents/Notes.docx
+++ b/Documents/Notes.docx
@@ -222,15 +222,7 @@
         <w:spacing w:after="0"/>
       </w:pPr>
       <w:r>
-        <w:t xml:space="preserve">Fastest speed with wifi = 1ms, </w:t>
-      </w:r>
-      <w:proofErr w:type="spellStart"/>
-      <w:r>
-        <w:t>wdog</w:t>
-      </w:r>
-      <w:proofErr w:type="spellEnd"/>
-      <w:r>
-        <w:t xml:space="preserve"> 0.8ms</w:t>
+        <w:t>Fastest speed with wifi = 1ms, wdog 0.8ms</w:t>
       </w:r>
       <w:r>
         <w:t>. Not any more lol. Fastest speed will be application specific. This was with a single core though</w:t>
@@ -254,21 +246,11 @@
       <w:r>
         <w:t xml:space="preserve">When switching to S3 chip, tasks </w:t>
       </w:r>
-      <w:proofErr w:type="spellStart"/>
       <w:r>
         <w:t>EspNowTask</w:t>
       </w:r>
-      <w:proofErr w:type="spellEnd"/>
-      <w:r>
-        <w:t xml:space="preserve"> and </w:t>
-      </w:r>
-      <w:proofErr w:type="spellStart"/>
-      <w:r>
-        <w:t>UdpProcessingTask</w:t>
-      </w:r>
-      <w:proofErr w:type="spellEnd"/>
-      <w:r>
-        <w:t xml:space="preserve"> need more stack size to work. Unsure why this is for now, but not a major issue</w:t>
+      <w:r>
+        <w:t xml:space="preserve"> and UdpProcessingTask need more stack size to work. Unsure why this is for now, but not a major issue</w:t>
       </w:r>
       <w:r>
         <w:t>. Could be due to different core architectures processing commands differently, and different storage mechanisms in eac</w:t>
@@ -442,37 +424,8 @@
         </w:tabs>
         <w:spacing w:after="0"/>
       </w:pPr>
-      <w:proofErr w:type="spellStart"/>
-      <w:r>
-        <w:t>IsAccessPoint</w:t>
-      </w:r>
-      <w:proofErr w:type="spellEnd"/>
-      <w:r>
-        <w:t xml:space="preserve"> needs to be </w:t>
-      </w:r>
-      <w:proofErr w:type="spellStart"/>
-      <w:r>
-        <w:t>constexpr</w:t>
-      </w:r>
-      <w:proofErr w:type="spellEnd"/>
-      <w:r>
-        <w:t xml:space="preserve"> to </w:t>
-      </w:r>
-      <w:proofErr w:type="spellStart"/>
-      <w:r>
-        <w:t>init</w:t>
-      </w:r>
-      <w:proofErr w:type="spellEnd"/>
-      <w:r>
-        <w:t xml:space="preserve"> at compile time, else the </w:t>
-      </w:r>
-      <w:proofErr w:type="spellStart"/>
-      <w:r>
-        <w:t>app_main</w:t>
-      </w:r>
-      <w:proofErr w:type="spellEnd"/>
-      <w:r>
-        <w:t xml:space="preserve"> breaks by running the timer code twice.</w:t>
+      <w:r>
+        <w:t>IsAccessPoint needs to be constexpr to init at compile time, else the app_main breaks by running the timer code twice.</w:t>
       </w:r>
     </w:p>
     <w:p>
@@ -706,6 +659,34 @@
       <w:pPr>
         <w:spacing w:after="0"/>
       </w:pPr>
+      <w:r>
+        <w:t>COM11 = 01</w:t>
+      </w:r>
+    </w:p>
+    <w:p>
+      <w:pPr>
+        <w:spacing w:after="0"/>
+      </w:pPr>
+      <w:r>
+        <w:lastRenderedPageBreak/>
+        <w:t>COM12 = 02</w:t>
+      </w:r>
+    </w:p>
+    <w:p>
+      <w:pPr>
+        <w:spacing w:after="0"/>
+      </w:pPr>
+      <w:r>
+        <w:t>COM13 = 03</w:t>
+      </w:r>
+    </w:p>
+    <w:p>
+      <w:pPr>
+        <w:spacing w:after="0"/>
+      </w:pPr>
+      <w:r>
+        <w:t>COM14 = 04</w:t>
+      </w:r>
     </w:p>
     <w:sectPr>
       <w:pgSz w:w="12240" w:h="15840"/>

</xml_diff>